<commit_message>
P7-P8: add flat shading and wave controls
</commit_message>
<xml_diff>
--- a/EgcLab03/Raspunsuri_Lab03.docx
+++ b/EgcLab03/Raspunsuri_Lab03.docx
@@ -546,6 +546,66 @@
         <w:t>gpu-ul calculeaza varfurile in paralel, iar programul trimite doar cateva uniforme. vbo-ul ramane neschimbat si nu trebuie transferat intregul tablou de varfuri la fiecare cadru.</w:t>
       </w:r>
     </w:p>
+    <w:p>
+      <w:pPr>
+        <w:pStyle w:val="Heading1"/>
+      </w:pPr>
+      <w:r>
+        <w:t>problema 6</w:t>
+      </w:r>
+    </w:p>
+    <w:p>
+      <w:pPr/>
+      <w:r>
+        <w:t>intrebare: ce se schimba prin M pentru inelul cu sase varfuri si sase indici?</w:t>
+      </w:r>
+    </w:p>
+    <w:p>
+      <w:pPr/>
+      <w:r>
+        <w:t>raspuns: M parcurge Points, Lines, LineStrip, LineLoop, Triangles, TriangleStrip si TriangleFan. fiecare mod grupeaza aceiasi indici diferit; LineLoop inchide conturul, iar modurile cu triunghiuri formeaza suprafete.</w:t>
+      </w:r>
+    </w:p>
+    <w:p>
+      <w:pPr>
+        <w:pStyle w:val="Heading1"/>
+      </w:pPr>
+      <w:r>
+        <w:t>problema 7</w:t>
+      </w:r>
+    </w:p>
+    <w:p>
+      <w:pPr/>
+      <w:r>
+        <w:t>intrebare: ce culoare primeste triunghiul in flat shading?</w:t>
+      </w:r>
+    </w:p>
+    <w:p>
+      <w:pPr/>
+      <w:r>
+        <w:t>raspuns: flat shading pastreaza o culoare pe fiecare primitiva; cu conventia OpenGL implicita, ultimul varf din ordinea indicilor este varful provocator, iar culoarea lui se aplica intregului triunghi.</w:t>
+      </w:r>
+    </w:p>
+    <w:p>
+      <w:pPr>
+        <w:pStyle w:val="Heading1"/>
+      </w:pPr>
+      <w:r>
+        <w:t>problema 8</w:t>
+      </w:r>
+    </w:p>
+    <w:p>
+      <w:pPr/>
+      <w:r>
+        <w:t>intrebare: de ce pare unda fragmentata la frecvente mari?</w:t>
+      </w:r>
+    </w:p>
+    <w:p>
+      <w:pPr/>
+      <w:r>
+        <w:t>raspuns: grila are doar 17 x 9 varfuri, iar varfurile sunt esantionate prea rar pentru frecvente mari. triunghiurile interpoleaza liniar intre aceste puncte, deci crestele dintre varfuri lipsesc si unda pare fragmentata.</w:t>
+      </w:r>
+    </w:p>
     <w:sectPr>
       <w:pgSz w:w="12240" w:h="15840"/>
       <w:pgMar w:top="1037" w:right="1181" w:bottom="1037" w:left="1181" w:header="720" w:footer="720" w:gutter="0"/>

</xml_diff>